<commit_message>
Add Docker support for full application deployment
- Introduced Dockerfile for backend service to build and run the Spring Boot application.
- Added Dockerfile for frontend service to build and serve the React application using Nginx.
- Created docker-compose.yml to orchestrate MySQL, backend, and frontend services.
- Updated README.md with instructions for Docker deployment.
- Modified application.yml to use environment variables for database and email configurations.
- Added health checks and volume persistence for MySQL in docker-compose.
- Included nginx.conf for proper routing and API proxying in the frontend service.
- Updated functional specification documents to reflect project team changes and structure.
- Added a master test plan spreadsheet for organized testing efforts.
</commit_message>
<xml_diff>
--- a/docs/EV Seminar Registration System Functional Specification.docx
+++ b/docs/EV Seminar Registration System Functional Specification.docx
@@ -26,7 +26,7 @@
     <w:p>
       <w:r>
         <w:pict w14:anchorId="118F3DB9">
-          <v:rect id="_x0000_i4141" style="width:0;height:1.5pt" o:hralign="center" o:hrstd="t" o:hr="t"/>
+          <v:rect id="_x0000_i1025" style="width:0;height:1.5pt" o:hralign="center" o:hrstd="t" o:hr="t"/>
         </w:pict>
       </w:r>
     </w:p>
@@ -88,7 +88,7 @@
     <w:p>
       <w:r>
         <w:pict w14:anchorId="420314C3">
-          <v:rect id="_x0000_i4142" style="width:0;height:1.5pt" o:hralign="center" o:hrstd="t" o:hr="t"/>
+          <v:rect id="_x0000_i1026" style="width:0;height:1.5pt" o:hralign="center" o:hrstd="t" o:hr="t"/>
         </w:pict>
       </w:r>
     </w:p>
@@ -139,7 +139,7 @@
         </w:trPr>
         <w:tc>
           <w:tcPr>
-            <w:tcW w:w="844" w:type="dxa"/>
+            <w:tcW w:w="1021" w:type="dxa"/>
           </w:tcPr>
           <w:p>
             <w:pPr>
@@ -152,7 +152,7 @@
         </w:tc>
         <w:tc>
           <w:tcPr>
-            <w:tcW w:w="1267" w:type="dxa"/>
+            <w:tcW w:w="1532" w:type="dxa"/>
           </w:tcPr>
           <w:p>
             <w:pPr>
@@ -165,7 +165,7 @@
         </w:tc>
         <w:tc>
           <w:tcPr>
-            <w:tcW w:w="1372" w:type="dxa"/>
+            <w:tcW w:w="1659" w:type="dxa"/>
           </w:tcPr>
           <w:p>
             <w:pPr>
@@ -178,7 +178,7 @@
         </w:tc>
         <w:tc>
           <w:tcPr>
-            <w:tcW w:w="4435" w:type="dxa"/>
+            <w:tcW w:w="5364" w:type="dxa"/>
           </w:tcPr>
           <w:p>
             <w:pPr>
@@ -193,7 +193,7 @@
       <w:tr>
         <w:tc>
           <w:tcPr>
-            <w:tcW w:w="844" w:type="dxa"/>
+            <w:tcW w:w="1021" w:type="dxa"/>
           </w:tcPr>
           <w:p>
             <w:pPr>
@@ -206,7 +206,7 @@
         </w:tc>
         <w:tc>
           <w:tcPr>
-            <w:tcW w:w="1267" w:type="dxa"/>
+            <w:tcW w:w="1532" w:type="dxa"/>
           </w:tcPr>
           <w:p>
             <w:pPr>
@@ -219,7 +219,7 @@
         </w:tc>
         <w:tc>
           <w:tcPr>
-            <w:tcW w:w="1372" w:type="dxa"/>
+            <w:tcW w:w="1659" w:type="dxa"/>
           </w:tcPr>
           <w:p>
             <w:pPr>
@@ -232,7 +232,7 @@
         </w:tc>
         <w:tc>
           <w:tcPr>
-            <w:tcW w:w="4435" w:type="dxa"/>
+            <w:tcW w:w="5364" w:type="dxa"/>
           </w:tcPr>
           <w:p>
             <w:pPr>
@@ -247,7 +247,7 @@
       <w:tr>
         <w:tc>
           <w:tcPr>
-            <w:tcW w:w="844" w:type="dxa"/>
+            <w:tcW w:w="1021" w:type="dxa"/>
           </w:tcPr>
           <w:p>
             <w:pPr>
@@ -260,7 +260,7 @@
         </w:tc>
         <w:tc>
           <w:tcPr>
-            <w:tcW w:w="1267" w:type="dxa"/>
+            <w:tcW w:w="1532" w:type="dxa"/>
           </w:tcPr>
           <w:p>
             <w:pPr>
@@ -273,7 +273,7 @@
         </w:tc>
         <w:tc>
           <w:tcPr>
-            <w:tcW w:w="1372" w:type="dxa"/>
+            <w:tcW w:w="1659" w:type="dxa"/>
           </w:tcPr>
           <w:p>
             <w:pPr>
@@ -286,7 +286,7 @@
         </w:tc>
         <w:tc>
           <w:tcPr>
-            <w:tcW w:w="4435" w:type="dxa"/>
+            <w:tcW w:w="5364" w:type="dxa"/>
           </w:tcPr>
           <w:p>
             <w:pPr>
@@ -301,7 +301,7 @@
       <w:tr>
         <w:tc>
           <w:tcPr>
-            <w:tcW w:w="844" w:type="dxa"/>
+            <w:tcW w:w="1021" w:type="dxa"/>
           </w:tcPr>
           <w:p>
             <w:pPr>
@@ -314,7 +314,7 @@
         </w:tc>
         <w:tc>
           <w:tcPr>
-            <w:tcW w:w="1267" w:type="dxa"/>
+            <w:tcW w:w="1532" w:type="dxa"/>
           </w:tcPr>
           <w:p>
             <w:pPr>
@@ -327,7 +327,7 @@
         </w:tc>
         <w:tc>
           <w:tcPr>
-            <w:tcW w:w="1372" w:type="dxa"/>
+            <w:tcW w:w="1659" w:type="dxa"/>
           </w:tcPr>
           <w:p>
             <w:pPr>
@@ -340,7 +340,7 @@
         </w:tc>
         <w:tc>
           <w:tcPr>
-            <w:tcW w:w="4435" w:type="dxa"/>
+            <w:tcW w:w="5364" w:type="dxa"/>
           </w:tcPr>
           <w:p>
             <w:pPr>
@@ -349,6 +349,86 @@
             <w:r>
               <w:t>Baseline version for implementation</w:t>
             </w:r>
+          </w:p>
+        </w:tc>
+      </w:tr>
+      <w:tr>
+        <w:tc>
+          <w:tcPr>
+            <w:tcW w:w="1021" w:type="dxa"/>
+          </w:tcPr>
+          <w:p>
+            <w:pPr>
+              <w:pStyle w:val="Compact"/>
+              <w:rPr>
+                <w:rFonts w:hint="eastAsia"/>
+                <w:lang w:eastAsia="zh-TW"/>
+              </w:rPr>
+            </w:pPr>
+            <w:r>
+              <w:rPr>
+                <w:rFonts w:hint="eastAsia"/>
+                <w:lang w:eastAsia="zh-TW"/>
+              </w:rPr>
+              <w:t>1.1</w:t>
+            </w:r>
+          </w:p>
+        </w:tc>
+        <w:tc>
+          <w:tcPr>
+            <w:tcW w:w="1532" w:type="dxa"/>
+          </w:tcPr>
+          <w:p>
+            <w:pPr>
+              <w:pStyle w:val="Compact"/>
+              <w:rPr>
+                <w:rFonts w:hint="eastAsia"/>
+                <w:lang w:eastAsia="zh-TW"/>
+              </w:rPr>
+            </w:pPr>
+            <w:r>
+              <w:rPr>
+                <w:rFonts w:hint="eastAsia"/>
+                <w:lang w:eastAsia="zh-TW"/>
+              </w:rPr>
+              <w:t>2026-04-26</w:t>
+            </w:r>
+          </w:p>
+        </w:tc>
+        <w:tc>
+          <w:tcPr>
+            <w:tcW w:w="1659" w:type="dxa"/>
+          </w:tcPr>
+          <w:p>
+            <w:pPr>
+              <w:pStyle w:val="Compact"/>
+            </w:pPr>
+            <w:r>
+              <w:t>Project Team</w:t>
+            </w:r>
+          </w:p>
+        </w:tc>
+        <w:tc>
+          <w:tcPr>
+            <w:tcW w:w="5364" w:type="dxa"/>
+          </w:tcPr>
+          <w:p>
+            <w:pPr>
+              <w:pStyle w:val="Compact"/>
+              <w:rPr>
+                <w:rFonts w:hint="eastAsia"/>
+                <w:lang w:eastAsia="zh-TW"/>
+              </w:rPr>
+            </w:pPr>
+            <w:proofErr w:type="gramStart"/>
+            <w:r>
+              <w:rPr>
+                <w:rFonts w:hint="eastAsia"/>
+                <w:lang w:eastAsia="zh-TW"/>
+              </w:rPr>
+              <w:t>Fine-turn</w:t>
+            </w:r>
+            <w:proofErr w:type="gramEnd"/>
           </w:p>
         </w:tc>
       </w:tr>
@@ -379,7 +459,7 @@
       </w:tblPr>
       <w:tblGrid>
         <w:gridCol w:w="2451"/>
-        <w:gridCol w:w="3032"/>
+        <w:gridCol w:w="3272"/>
       </w:tblGrid>
       <w:tr>
         <w:trPr>
@@ -492,7 +572,7 @@
               <w:pStyle w:val="Compact"/>
             </w:pPr>
             <w:r>
-              <w:t>&lt;Group Leader Name&gt;</w:t>
+              <w:t>Ho Shun Chit (24075366S)</w:t>
             </w:r>
           </w:p>
         </w:tc>
@@ -520,7 +600,35 @@
               <w:pStyle w:val="Compact"/>
             </w:pPr>
             <w:r>
-              <w:t>SEHS4701 Group Members</w:t>
+              <w:t xml:space="preserve">Tsui Ka Ho (24055841S) </w:t>
+            </w:r>
+          </w:p>
+          <w:p>
+            <w:pPr>
+              <w:pStyle w:val="Compact"/>
+            </w:pPr>
+            <w:r>
+              <w:t>Cheng Shing Hin (24057220S)</w:t>
+            </w:r>
+          </w:p>
+          <w:p>
+            <w:pPr>
+              <w:pStyle w:val="Compact"/>
+            </w:pPr>
+            <w:r>
+              <w:t>Mak Yee Ting (24048708S)</w:t>
+            </w:r>
+          </w:p>
+          <w:p>
+            <w:pPr>
+              <w:pStyle w:val="Compact"/>
+              <w:rPr>
+                <w:rFonts w:hint="eastAsia"/>
+                <w:lang w:eastAsia="zh-TW"/>
+              </w:rPr>
+            </w:pPr>
+            <w:r>
+              <w:t xml:space="preserve">Yu Hao (24042452S) </w:t>
             </w:r>
           </w:p>
         </w:tc>
@@ -529,7 +637,7 @@
     <w:p>
       <w:r>
         <w:pict w14:anchorId="5E7537CC">
-          <v:rect id="_x0000_i4143" style="width:0;height:1.5pt" o:hralign="center" o:hrstd="t" o:hr="t"/>
+          <v:rect id="_x0000_i1027" style="width:0;height:1.5pt" o:hralign="center" o:hrstd="t" o:hr="t"/>
         </w:pict>
       </w:r>
     </w:p>
@@ -891,7 +999,7 @@
     <w:p>
       <w:r>
         <w:pict w14:anchorId="5E5E9C80">
-          <v:rect id="_x0000_i4144" style="width:0;height:1.5pt" o:hralign="center" o:hrstd="t" o:hr="t"/>
+          <v:rect id="_x0000_i1028" style="width:0;height:1.5pt" o:hralign="center" o:hrstd="t" o:hr="t"/>
         </w:pict>
       </w:r>
     </w:p>
@@ -1031,7 +1139,7 @@
     <w:p>
       <w:r>
         <w:pict w14:anchorId="2F91B7F1">
-          <v:rect id="_x0000_i4145" style="width:0;height:1.5pt" o:hralign="center" o:hrstd="t" o:hr="t"/>
+          <v:rect id="_x0000_i1029" style="width:0;height:1.5pt" o:hralign="center" o:hrstd="t" o:hr="t"/>
         </w:pict>
       </w:r>
     </w:p>
@@ -2283,7 +2391,7 @@
     <w:p>
       <w:r>
         <w:pict w14:anchorId="39E7D096">
-          <v:rect id="_x0000_i4146" style="width:0;height:1.5pt" o:hralign="center" o:hrstd="t" o:hr="t"/>
+          <v:rect id="_x0000_i1030" style="width:0;height:1.5pt" o:hralign="center" o:hrstd="t" o:hr="t"/>
         </w:pict>
       </w:r>
     </w:p>
@@ -2661,7 +2769,7 @@
     <w:p>
       <w:r>
         <w:pict w14:anchorId="4DDFFAF5">
-          <v:rect id="_x0000_i4147" style="width:0;height:1.5pt" o:hralign="center" o:hrstd="t" o:hr="t"/>
+          <v:rect id="_x0000_i1031" style="width:0;height:1.5pt" o:hralign="center" o:hrstd="t" o:hr="t"/>
         </w:pict>
       </w:r>
     </w:p>
@@ -2745,7 +2853,7 @@
     <w:p>
       <w:r>
         <w:pict w14:anchorId="29337828">
-          <v:rect id="_x0000_i4148" style="width:0;height:1.5pt" o:hralign="center" o:hrstd="t" o:hr="t"/>
+          <v:rect id="_x0000_i1032" style="width:0;height:1.5pt" o:hralign="center" o:hrstd="t" o:hr="t"/>
         </w:pict>
       </w:r>
     </w:p>
@@ -2804,7 +2912,7 @@
     <w:p>
       <w:r>
         <w:pict w14:anchorId="04D6ABB9">
-          <v:rect id="_x0000_i4149" style="width:0;height:1.5pt" o:hralign="center" o:hrstd="t" o:hr="t"/>
+          <v:rect id="_x0000_i1033" style="width:0;height:1.5pt" o:hralign="center" o:hrstd="t" o:hr="t"/>
         </w:pict>
       </w:r>
     </w:p>
@@ -2915,7 +3023,7 @@
     <w:p>
       <w:r>
         <w:pict w14:anchorId="6E7A2F4A">
-          <v:rect id="_x0000_i4150" style="width:0;height:1.5pt" o:hralign="center" o:hrstd="t" o:hr="t"/>
+          <v:rect id="_x0000_i1034" style="width:0;height:1.5pt" o:hralign="center" o:hrstd="t" o:hr="t"/>
         </w:pict>
       </w:r>
     </w:p>
@@ -3038,7 +3146,7 @@
     <w:p>
       <w:r>
         <w:pict w14:anchorId="60B9B2FB">
-          <v:rect id="_x0000_i4151" style="width:0;height:1.5pt" o:hralign="center" o:hrstd="t" o:hr="t"/>
+          <v:rect id="_x0000_i1035" style="width:0;height:1.5pt" o:hralign="center" o:hrstd="t" o:hr="t"/>
         </w:pict>
       </w:r>
     </w:p>
@@ -3142,7 +3250,7 @@
     <w:p>
       <w:r>
         <w:pict w14:anchorId="6CE57D76">
-          <v:rect id="_x0000_i4152" style="width:0;height:1.5pt" o:hralign="center" o:hrstd="t" o:hr="t"/>
+          <v:rect id="_x0000_i1036" style="width:0;height:1.5pt" o:hralign="center" o:hrstd="t" o:hr="t"/>
         </w:pict>
       </w:r>
     </w:p>
@@ -3231,7 +3339,7 @@
     <w:p>
       <w:r>
         <w:pict w14:anchorId="7F5D6FCE">
-          <v:rect id="_x0000_i4153" style="width:0;height:1.5pt" o:hralign="center" o:hrstd="t" o:hr="t"/>
+          <v:rect id="_x0000_i1037" style="width:0;height:1.5pt" o:hralign="center" o:hrstd="t" o:hr="t"/>
         </w:pict>
       </w:r>
     </w:p>
@@ -3300,7 +3408,7 @@
     <w:p>
       <w:r>
         <w:pict w14:anchorId="7D1515F3">
-          <v:rect id="_x0000_i4154" style="width:0;height:1.5pt" o:hralign="center" o:hrstd="t" o:hr="t"/>
+          <v:rect id="_x0000_i1038" style="width:0;height:1.5pt" o:hralign="center" o:hrstd="t" o:hr="t"/>
         </w:pict>
       </w:r>
     </w:p>
@@ -3760,7 +3868,7 @@
     <w:p>
       <w:r>
         <w:pict w14:anchorId="1F570EB5">
-          <v:rect id="_x0000_i4155" style="width:0;height:1.5pt" o:hralign="center" o:hrstd="t" o:hr="t"/>
+          <v:rect id="_x0000_i1039" style="width:0;height:1.5pt" o:hralign="center" o:hrstd="t" o:hr="t"/>
         </w:pict>
       </w:r>
     </w:p>
@@ -4302,7 +4410,15 @@
             </w:r>
             <w:proofErr w:type="gramEnd"/>
             <w:r>
-              <w:t>Active’,‘Inactive’)</w:t>
+              <w:t>Active</w:t>
+            </w:r>
+            <w:proofErr w:type="gramStart"/>
+            <w:r>
+              <w:t>’,‘</w:t>
+            </w:r>
+            <w:proofErr w:type="gramEnd"/>
+            <w:r>
+              <w:t>Inactive’)</w:t>
             </w:r>
           </w:p>
         </w:tc>
@@ -5588,7 +5704,23 @@
             </w:r>
             <w:proofErr w:type="gramEnd"/>
             <w:r>
-              <w:t>Open’,‘Closed’,‘Cancelled’)</w:t>
+              <w:t>Open</w:t>
+            </w:r>
+            <w:proofErr w:type="gramStart"/>
+            <w:r>
+              <w:t>’,‘</w:t>
+            </w:r>
+            <w:proofErr w:type="gramEnd"/>
+            <w:r>
+              <w:t>Closed</w:t>
+            </w:r>
+            <w:proofErr w:type="gramStart"/>
+            <w:r>
+              <w:t>’,‘</w:t>
+            </w:r>
+            <w:proofErr w:type="gramEnd"/>
+            <w:r>
+              <w:t>Cancelled’)</w:t>
             </w:r>
           </w:p>
         </w:tc>
@@ -5949,7 +6081,15 @@
             </w:r>
             <w:proofErr w:type="gramEnd"/>
             <w:r>
-              <w:t>Wait’,‘Cancel’)</w:t>
+              <w:t>Wait</w:t>
+            </w:r>
+            <w:proofErr w:type="gramStart"/>
+            <w:r>
+              <w:t>’,‘</w:t>
+            </w:r>
+            <w:proofErr w:type="gramEnd"/>
+            <w:r>
+              <w:t>Cancel’)</w:t>
             </w:r>
           </w:p>
         </w:tc>
@@ -6645,7 +6785,7 @@
     <w:p>
       <w:r>
         <w:pict w14:anchorId="67AA6E8C">
-          <v:rect id="_x0000_i4156" style="width:0;height:1.5pt" o:hralign="center" o:hrstd="t" o:hr="t"/>
+          <v:rect id="_x0000_i1040" style="width:0;height:1.5pt" o:hralign="center" o:hrstd="t" o:hr="t"/>
         </w:pict>
       </w:r>
     </w:p>
@@ -7014,7 +7154,7 @@
     <w:p>
       <w:r>
         <w:pict w14:anchorId="78339924">
-          <v:rect id="_x0000_i4157" style="width:0;height:1.5pt" o:hralign="center" o:hrstd="t" o:hr="t"/>
+          <v:rect id="_x0000_i1041" style="width:0;height:1.5pt" o:hralign="center" o:hrstd="t" o:hr="t"/>
         </w:pict>
       </w:r>
     </w:p>
@@ -7334,7 +7474,15 @@
             </w:r>
             <w:proofErr w:type="gramEnd"/>
             <w:r>
-              <w:t xml:space="preserve"> require new code.</w:t>
+              <w:t xml:space="preserve"> </w:t>
+            </w:r>
+            <w:proofErr w:type="gramStart"/>
+            <w:r>
+              <w:t>require</w:t>
+            </w:r>
+            <w:proofErr w:type="gramEnd"/>
+            <w:r>
+              <w:t xml:space="preserve"> new code.</w:t>
             </w:r>
           </w:p>
         </w:tc>
@@ -7867,7 +8015,7 @@
     <w:p>
       <w:r>
         <w:pict w14:anchorId="60DB1A55">
-          <v:rect id="_x0000_i4158" style="width:0;height:1.5pt" o:hralign="center" o:hrstd="t" o:hr="t"/>
+          <v:rect id="_x0000_i1042" style="width:0;height:1.5pt" o:hralign="center" o:hrstd="t" o:hr="t"/>
         </w:pict>
       </w:r>
     </w:p>
@@ -7971,7 +8119,7 @@
     <w:p>
       <w:r>
         <w:pict w14:anchorId="3E0A578D">
-          <v:rect id="_x0000_i4159" style="width:0;height:1.5pt" o:hralign="center" o:hrstd="t" o:hr="t"/>
+          <v:rect id="_x0000_i1043" style="width:0;height:1.5pt" o:hralign="center" o:hrstd="t" o:hr="t"/>
         </w:pict>
       </w:r>
     </w:p>
@@ -8011,6 +8159,56 @@
     </w:sectPr>
   </w:body>
 </w:document>
+</file>
+
+<file path=word/endnotes.xml><?xml version="1.0" encoding="utf-8"?>
+<w:endnotes xmlns:wpc="http://schemas.microsoft.com/office/word/2010/wordprocessingCanvas" xmlns:cx="http://schemas.microsoft.com/office/drawing/2014/chartex" xmlns:cx1="http://schemas.microsoft.com/office/drawing/2015/9/8/chartex" xmlns:cx2="http://schemas.microsoft.com/office/drawing/2015/10/21/chartex" xmlns:cx3="http://schemas.microsoft.com/office/drawing/2016/5/9/chartex" xmlns:cx4="http://schemas.microsoft.com/office/drawing/2016/5/10/chartex" xmlns:cx5="http://schemas.microsoft.com/office/drawing/2016/5/11/chartex" xmlns:cx6="http://schemas.microsoft.com/office/drawing/2016/5/12/chartex" xmlns:cx7="http://schemas.microsoft.com/office/drawing/2016/5/13/chartex" xmlns:cx8="http://schemas.microsoft.com/office/drawing/2016/5/14/chartex" xmlns:mc="http://schemas.openxmlformats.org/markup-compatibility/2006" xmlns:aink="http://schemas.microsoft.com/office/drawing/2016/ink" xmlns:am3d="http://schemas.microsoft.com/office/drawing/2017/model3d" xmlns:o="urn:schemas-microsoft-com:office:office" xmlns:oel="http://schemas.microsoft.com/office/2019/extlst" xmlns:r="http://schemas.openxmlformats.org/officeDocument/2006/relationships" xmlns:m="http://schemas.openxmlformats.org/officeDocument/2006/math" xmlns:v="urn:schemas-microsoft-com:vml" xmlns:wp14="http://schemas.microsoft.com/office/word/2010/wordprocessingDrawing" xmlns:wp="http://schemas.openxmlformats.org/drawingml/2006/wordprocessingDrawing" xmlns:w10="urn:schemas-microsoft-com:office:word" xmlns:w="http://schemas.openxmlformats.org/wordprocessingml/2006/main" xmlns:w14="http://schemas.microsoft.com/office/word/2010/wordml" xmlns:w15="http://schemas.microsoft.com/office/word/2012/wordml" xmlns:w16cex="http://schemas.microsoft.com/office/word/2018/wordml/cex" xmlns:w16cid="http://schemas.microsoft.com/office/word/2016/wordml/cid" xmlns:w16="http://schemas.microsoft.com/office/word/2018/wordml" xmlns:w16du="http://schemas.microsoft.com/office/word/2023/wordml/word16du" xmlns:w16sdtdh="http://schemas.microsoft.com/office/word/2020/wordml/sdtdatahash" xmlns:w16sdtfl="http://schemas.microsoft.com/office/word/2024/wordml/sdtformatlock" xmlns:w16se="http://schemas.microsoft.com/office/word/2015/wordml/symex" xmlns:wpg="http://schemas.microsoft.com/office/word/2010/wordprocessingGroup" xmlns:wpi="http://schemas.microsoft.com/office/word/2010/wordprocessingInk" xmlns:wne="http://schemas.microsoft.com/office/word/2006/wordml" xmlns:wps="http://schemas.microsoft.com/office/word/2010/wordprocessingShape" mc:Ignorable="w14 w15 w16se w16cid w16 w16cex w16sdtdh w16sdtfl w16du wp14">
+  <w:endnote w:type="separator" w:id="-1">
+    <w:p>
+      <w:pPr>
+        <w:spacing w:after="0"/>
+      </w:pPr>
+      <w:r>
+        <w:separator/>
+      </w:r>
+    </w:p>
+  </w:endnote>
+  <w:endnote w:type="continuationSeparator" w:id="0">
+    <w:p>
+      <w:pPr>
+        <w:spacing w:after="0"/>
+      </w:pPr>
+      <w:r>
+        <w:continuationSeparator/>
+      </w:r>
+    </w:p>
+  </w:endnote>
+</w:endnotes>
+</file>
+
+<file path=word/footnotes.xml><?xml version="1.0" encoding="utf-8"?>
+<w:footnotes xmlns:wpc="http://schemas.microsoft.com/office/word/2010/wordprocessingCanvas" xmlns:cx="http://schemas.microsoft.com/office/drawing/2014/chartex" xmlns:cx1="http://schemas.microsoft.com/office/drawing/2015/9/8/chartex" xmlns:cx2="http://schemas.microsoft.com/office/drawing/2015/10/21/chartex" xmlns:cx3="http://schemas.microsoft.com/office/drawing/2016/5/9/chartex" xmlns:cx4="http://schemas.microsoft.com/office/drawing/2016/5/10/chartex" xmlns:cx5="http://schemas.microsoft.com/office/drawing/2016/5/11/chartex" xmlns:cx6="http://schemas.microsoft.com/office/drawing/2016/5/12/chartex" xmlns:cx7="http://schemas.microsoft.com/office/drawing/2016/5/13/chartex" xmlns:cx8="http://schemas.microsoft.com/office/drawing/2016/5/14/chartex" xmlns:mc="http://schemas.openxmlformats.org/markup-compatibility/2006" xmlns:aink="http://schemas.microsoft.com/office/drawing/2016/ink" xmlns:am3d="http://schemas.microsoft.com/office/drawing/2017/model3d" xmlns:o="urn:schemas-microsoft-com:office:office" xmlns:oel="http://schemas.microsoft.com/office/2019/extlst" xmlns:r="http://schemas.openxmlformats.org/officeDocument/2006/relationships" xmlns:m="http://schemas.openxmlformats.org/officeDocument/2006/math" xmlns:v="urn:schemas-microsoft-com:vml" xmlns:wp14="http://schemas.microsoft.com/office/word/2010/wordprocessingDrawing" xmlns:wp="http://schemas.openxmlformats.org/drawingml/2006/wordprocessingDrawing" xmlns:w10="urn:schemas-microsoft-com:office:word" xmlns:w="http://schemas.openxmlformats.org/wordprocessingml/2006/main" xmlns:w14="http://schemas.microsoft.com/office/word/2010/wordml" xmlns:w15="http://schemas.microsoft.com/office/word/2012/wordml" xmlns:w16cex="http://schemas.microsoft.com/office/word/2018/wordml/cex" xmlns:w16cid="http://schemas.microsoft.com/office/word/2016/wordml/cid" xmlns:w16="http://schemas.microsoft.com/office/word/2018/wordml" xmlns:w16du="http://schemas.microsoft.com/office/word/2023/wordml/word16du" xmlns:w16sdtdh="http://schemas.microsoft.com/office/word/2020/wordml/sdtdatahash" xmlns:w16sdtfl="http://schemas.microsoft.com/office/word/2024/wordml/sdtformatlock" xmlns:w16se="http://schemas.microsoft.com/office/word/2015/wordml/symex" xmlns:wpg="http://schemas.microsoft.com/office/word/2010/wordprocessingGroup" xmlns:wpi="http://schemas.microsoft.com/office/word/2010/wordprocessingInk" xmlns:wne="http://schemas.microsoft.com/office/word/2006/wordml" xmlns:wps="http://schemas.microsoft.com/office/word/2010/wordprocessingShape" mc:Ignorable="w14 w15 w16se w16cid w16 w16cex w16sdtdh w16sdtfl w16du wp14">
+  <w:footnote w:type="separator" w:id="-1">
+    <w:p>
+      <w:pPr>
+        <w:spacing w:after="0"/>
+      </w:pPr>
+      <w:r>
+        <w:separator/>
+      </w:r>
+    </w:p>
+  </w:footnote>
+  <w:footnote w:type="continuationSeparator" w:id="0">
+    <w:p>
+      <w:pPr>
+        <w:spacing w:after="0"/>
+      </w:pPr>
+      <w:r>
+        <w:continuationSeparator/>
+      </w:r>
+    </w:p>
+  </w:footnote>
+</w:footnotes>
 </file>
 
 <file path=word/numbering.xml><?xml version="1.0" encoding="utf-8"?>
@@ -8640,7 +8838,7 @@
   <w:docDefaults>
     <w:rPrDefault>
       <w:rPr>
-        <w:rFonts w:asciiTheme="minorHAnsi" w:eastAsiaTheme="minorHAnsi" w:hAnsiTheme="minorHAnsi" w:cstheme="minorBidi"/>
+        <w:rFonts w:asciiTheme="minorHAnsi" w:eastAsia="新細明體" w:hAnsiTheme="minorHAnsi" w:cstheme="minorBidi"/>
         <w:sz w:val="24"/>
         <w:szCs w:val="24"/>
         <w:lang w:val="en-US" w:eastAsia="en-US" w:bidi="ar-SA"/>
@@ -9845,6 +10043,60 @@
       <w:sz w:val="22"/>
     </w:rPr>
   </w:style>
+  <w:style w:type="paragraph" w:styleId="Header">
+    <w:name w:val="header"/>
+    <w:basedOn w:val="Normal"/>
+    <w:link w:val="HeaderChar"/>
+    <w:rsid w:val="00A46E00"/>
+    <w:pPr>
+      <w:tabs>
+        <w:tab w:val="center" w:pos="4153"/>
+        <w:tab w:val="right" w:pos="8306"/>
+      </w:tabs>
+      <w:snapToGrid w:val="0"/>
+    </w:pPr>
+    <w:rPr>
+      <w:sz w:val="20"/>
+      <w:szCs w:val="20"/>
+    </w:rPr>
+  </w:style>
+  <w:style w:type="character" w:customStyle="1" w:styleId="HeaderChar">
+    <w:name w:val="Header Char"/>
+    <w:basedOn w:val="DefaultParagraphFont"/>
+    <w:link w:val="Header"/>
+    <w:rsid w:val="00A46E00"/>
+    <w:rPr>
+      <w:sz w:val="20"/>
+      <w:szCs w:val="20"/>
+    </w:rPr>
+  </w:style>
+  <w:style w:type="paragraph" w:styleId="Footer">
+    <w:name w:val="footer"/>
+    <w:basedOn w:val="Normal"/>
+    <w:link w:val="FooterChar"/>
+    <w:rsid w:val="00A46E00"/>
+    <w:pPr>
+      <w:tabs>
+        <w:tab w:val="center" w:pos="4153"/>
+        <w:tab w:val="right" w:pos="8306"/>
+      </w:tabs>
+      <w:snapToGrid w:val="0"/>
+    </w:pPr>
+    <w:rPr>
+      <w:sz w:val="20"/>
+      <w:szCs w:val="20"/>
+    </w:rPr>
+  </w:style>
+  <w:style w:type="character" w:customStyle="1" w:styleId="FooterChar">
+    <w:name w:val="Footer Char"/>
+    <w:basedOn w:val="DefaultParagraphFont"/>
+    <w:link w:val="Footer"/>
+    <w:rsid w:val="00A46E00"/>
+    <w:rPr>
+      <w:sz w:val="20"/>
+      <w:szCs w:val="20"/>
+    </w:rPr>
+  </w:style>
 </w:styles>
 </file>
 

</xml_diff>